<commit_message>
Add Module 4 technical report (Word) and final report text
Co-Authored-By: Claude Opus 5.5 <noreply@anthropic.com>
Claude-Session: https://claude.ai/code/session_016cynVQ63M7u4rNAnpHxuGB
</commit_message>
<xml_diff>
--- a/assignments/w4/W4_Technical_Report.docx
+++ b/assignments/w4/W4_Technical_Report.docx
@@ -150,15 +150,16 @@
         <w:jc w:val="center"/>
         <w:tblLayout w:type="fixed"/>
         <w:tblLook w:firstColumn="1" w:firstRow="1" w:lastColumn="0" w:lastRow="0" w:noHBand="0" w:noVBand="1" w:val="04A0"/>
+        <w:tblLayout w:type="fixed"/>
       </w:tblPr>
       <w:tblGrid>
-        <w:gridCol w:w="1337"/>
-        <w:gridCol w:w="1337"/>
-        <w:gridCol w:w="1337"/>
-        <w:gridCol w:w="1337"/>
-        <w:gridCol w:w="1337"/>
-        <w:gridCol w:w="1337"/>
-        <w:gridCol w:w="1337"/>
+        <w:gridCol w:w="1872"/>
+        <w:gridCol w:w="1238"/>
+        <w:gridCol w:w="1238"/>
+        <w:gridCol w:w="1238"/>
+        <w:gridCol w:w="1238"/>
+        <w:gridCol w:w="1238"/>
+        <w:gridCol w:w="1238"/>
       </w:tblGrid>
       <w:tr>
         <w:tc>
@@ -170,11 +171,15 @@
             <w:pPr>
               <w:spacing w:after="0"/>
             </w:pPr>
-            <w:r/>
+            <w:r>
+              <w:rPr>
+                <w:sz w:val="20"/>
+              </w:rPr>
+            </w:r>
             <w:r>
               <w:rPr>
                 <w:b/>
-                <w:sz w:val="22"/>
+                <w:sz w:val="20"/>
               </w:rPr>
               <w:t>Neighborhood</w:t>
             </w:r>
@@ -190,11 +195,15 @@
               <w:spacing w:after="0"/>
               <w:jc w:val="center"/>
             </w:pPr>
-            <w:r/>
+            <w:r>
+              <w:rPr>
+                <w:sz w:val="20"/>
+              </w:rPr>
+            </w:r>
             <w:r>
               <w:rPr>
                 <w:b/>
-                <w:sz w:val="22"/>
+                <w:sz w:val="20"/>
               </w:rPr>
               <w:t>Lots sampled (n)</w:t>
             </w:r>
@@ -210,11 +219,15 @@
               <w:spacing w:after="0"/>
               <w:jc w:val="center"/>
             </w:pPr>
-            <w:r/>
+            <w:r>
+              <w:rPr>
+                <w:sz w:val="20"/>
+              </w:rPr>
+            </w:r>
             <w:r>
               <w:rPr>
                 <w:b/>
-                <w:sz w:val="22"/>
+                <w:sz w:val="20"/>
               </w:rPr>
               <w:t>Lots rebuilt (x)</w:t>
             </w:r>
@@ -230,11 +243,15 @@
               <w:spacing w:after="0"/>
               <w:jc w:val="center"/>
             </w:pPr>
-            <w:r/>
+            <w:r>
+              <w:rPr>
+                <w:sz w:val="20"/>
+              </w:rPr>
+            </w:r>
             <w:r>
               <w:rPr>
                 <w:b/>
-                <w:sz w:val="22"/>
+                <w:sz w:val="20"/>
               </w:rPr>
               <w:t>Sample proportion (p̂)</w:t>
             </w:r>
@@ -250,11 +267,15 @@
               <w:spacing w:after="0"/>
               <w:jc w:val="center"/>
             </w:pPr>
-            <w:r/>
+            <w:r>
+              <w:rPr>
+                <w:sz w:val="20"/>
+              </w:rPr>
+            </w:r>
             <w:r>
               <w:rPr>
                 <w:b/>
-                <w:sz w:val="22"/>
+                <w:sz w:val="20"/>
               </w:rPr>
               <w:t>Margin of error</w:t>
             </w:r>
@@ -270,11 +291,15 @@
               <w:spacing w:after="0"/>
               <w:jc w:val="center"/>
             </w:pPr>
-            <w:r/>
+            <w:r>
+              <w:rPr>
+                <w:sz w:val="20"/>
+              </w:rPr>
+            </w:r>
             <w:r>
               <w:rPr>
                 <w:b/>
-                <w:sz w:val="22"/>
+                <w:sz w:val="20"/>
               </w:rPr>
               <w:t>95% CI lower bound</w:t>
             </w:r>
@@ -290,11 +315,15 @@
               <w:spacing w:after="0"/>
               <w:jc w:val="center"/>
             </w:pPr>
-            <w:r/>
+            <w:r>
+              <w:rPr>
+                <w:sz w:val="20"/>
+              </w:rPr>
+            </w:r>
             <w:r>
               <w:rPr>
                 <w:b/>
-                <w:sz w:val="22"/>
+                <w:sz w:val="20"/>
               </w:rPr>
               <w:t>95% CI upper bound</w:t>
             </w:r>

</xml_diff>